<commit_message>
Agregar color y correccion de palabra
</commit_message>
<xml_diff>
--- a/Requisitos de la Fase 1.docx
+++ b/Requisitos de la Fase 1.docx
@@ -217,6 +217,7 @@
           <w:lang w:val="en-US"/>
         </w:rPr>
       </w:pPr>
+      <w:proofErr w:type="spellStart"/>
       <w:r>
         <w:rPr>
           <w:rFonts w:ascii="Times New Roman" w:hAnsi="Times New Roman" w:cs="Times New Roman"/>
@@ -224,7 +225,17 @@
           <w:szCs w:val="24"/>
           <w:lang w:val="en-US"/>
         </w:rPr>
-        <w:t>Etiquetas: &lt;header&gt;, &lt;nav&gt;, &lt;main&gt;, &lt;section&gt;, &lt;footer&gt;</w:t>
+        <w:t>Etiquetas</w:t>
+      </w:r>
+      <w:proofErr w:type="spellEnd"/>
+      <w:r>
+        <w:rPr>
+          <w:rFonts w:ascii="Times New Roman" w:hAnsi="Times New Roman" w:cs="Times New Roman"/>
+          <w:sz w:val="24"/>
+          <w:szCs w:val="24"/>
+          <w:lang w:val="en-US"/>
+        </w:rPr>
+        <w:t>: &lt;header&gt;, &lt;nav&gt;, &lt;main&gt;, &lt;section&gt;, &lt;footer&gt;</w:t>
       </w:r>
     </w:p>
     <w:p>
@@ -498,7 +509,23 @@
           <w:sz w:val="24"/>
           <w:szCs w:val="24"/>
         </w:rPr>
-        <w:t>Trabajar en la rama fase-1-maquetacion</w:t>
+        <w:t>Trabajar en la rama fase-1-maquetaci</w:t>
+      </w:r>
+      <w:r>
+        <w:rPr>
+          <w:rFonts w:ascii="Times New Roman" w:hAnsi="Times New Roman" w:cs="Times New Roman"/>
+          <w:sz w:val="24"/>
+          <w:szCs w:val="24"/>
+        </w:rPr>
+        <w:t>ó</w:t>
+      </w:r>
+      <w:r>
+        <w:rPr>
+          <w:rFonts w:ascii="Times New Roman" w:hAnsi="Times New Roman" w:cs="Times New Roman"/>
+          <w:sz w:val="24"/>
+          <w:szCs w:val="24"/>
+        </w:rPr>
+        <w:t>n</w:t>
       </w:r>
     </w:p>
     <w:p>
@@ -522,7 +549,25 @@
           <w:sz w:val="24"/>
           <w:szCs w:val="24"/>
         </w:rPr>
-        <w:t>Realizar commits individuales por cada integrante</w:t>
+        <w:t xml:space="preserve">Realizar </w:t>
+      </w:r>
+      <w:proofErr w:type="spellStart"/>
+      <w:r>
+        <w:rPr>
+          <w:rFonts w:ascii="Times New Roman" w:hAnsi="Times New Roman" w:cs="Times New Roman"/>
+          <w:sz w:val="24"/>
+          <w:szCs w:val="24"/>
+        </w:rPr>
+        <w:t>commits</w:t>
+      </w:r>
+      <w:proofErr w:type="spellEnd"/>
+      <w:r>
+        <w:rPr>
+          <w:rFonts w:ascii="Times New Roman" w:hAnsi="Times New Roman" w:cs="Times New Roman"/>
+          <w:sz w:val="24"/>
+          <w:szCs w:val="24"/>
+        </w:rPr>
+        <w:t xml:space="preserve"> individuales por cada integrante</w:t>
       </w:r>
     </w:p>
     <w:p>
@@ -546,8 +591,36 @@
           <w:sz w:val="24"/>
           <w:szCs w:val="24"/>
         </w:rPr>
-        <w:t>Abrir un Pull Request hacia la rama main</w:t>
-      </w:r>
+        <w:t xml:space="preserve">Abrir un Pull </w:t>
+      </w:r>
+      <w:proofErr w:type="spellStart"/>
+      <w:r>
+        <w:rPr>
+          <w:rFonts w:ascii="Times New Roman" w:hAnsi="Times New Roman" w:cs="Times New Roman"/>
+          <w:sz w:val="24"/>
+          <w:szCs w:val="24"/>
+        </w:rPr>
+        <w:t>Request</w:t>
+      </w:r>
+      <w:proofErr w:type="spellEnd"/>
+      <w:r>
+        <w:rPr>
+          <w:rFonts w:ascii="Times New Roman" w:hAnsi="Times New Roman" w:cs="Times New Roman"/>
+          <w:sz w:val="24"/>
+          <w:szCs w:val="24"/>
+        </w:rPr>
+        <w:t xml:space="preserve"> hacia la rama </w:t>
+      </w:r>
+      <w:proofErr w:type="spellStart"/>
+      <w:r>
+        <w:rPr>
+          <w:rFonts w:ascii="Times New Roman" w:hAnsi="Times New Roman" w:cs="Times New Roman"/>
+          <w:sz w:val="24"/>
+          <w:szCs w:val="24"/>
+        </w:rPr>
+        <w:t>main</w:t>
+      </w:r>
+      <w:proofErr w:type="spellEnd"/>
     </w:p>
     <w:p>
       <w:pPr>
@@ -582,8 +655,20 @@
           <w:sz w:val="24"/>
           <w:szCs w:val="24"/>
         </w:rPr>
-        <w:t>Gestión en ClickUp</w:t>
-      </w:r>
+        <w:t xml:space="preserve">Gestión en </w:t>
+      </w:r>
+      <w:proofErr w:type="spellStart"/>
+      <w:r>
+        <w:rPr>
+          <w:rFonts w:ascii="Times New Roman" w:hAnsi="Times New Roman" w:cs="Times New Roman"/>
+          <w:b/>
+          <w:bCs/>
+          <w:sz w:val="24"/>
+          <w:szCs w:val="24"/>
+        </w:rPr>
+        <w:t>ClickUp</w:t>
+      </w:r>
+      <w:proofErr w:type="spellEnd"/>
     </w:p>
     <w:p>
       <w:pPr>
@@ -689,7 +774,25 @@
           <w:sz w:val="24"/>
           <w:szCs w:val="24"/>
         </w:rPr>
-        <w:t>Enlace al Pull Request de la rama fase-1-maquetacion en GitHub</w:t>
+        <w:t xml:space="preserve">Enlace al Pull </w:t>
+      </w:r>
+      <w:proofErr w:type="spellStart"/>
+      <w:r>
+        <w:rPr>
+          <w:rFonts w:ascii="Times New Roman" w:hAnsi="Times New Roman" w:cs="Times New Roman"/>
+          <w:sz w:val="24"/>
+          <w:szCs w:val="24"/>
+        </w:rPr>
+        <w:t>Request</w:t>
+      </w:r>
+      <w:proofErr w:type="spellEnd"/>
+      <w:r>
+        <w:rPr>
+          <w:rFonts w:ascii="Times New Roman" w:hAnsi="Times New Roman" w:cs="Times New Roman"/>
+          <w:sz w:val="24"/>
+          <w:szCs w:val="24"/>
+        </w:rPr>
+        <w:t xml:space="preserve"> de la rama fase-1-maquetacion en GitHub</w:t>
       </w:r>
     </w:p>
     <w:p>
@@ -713,8 +816,18 @@
           <w:sz w:val="24"/>
           <w:szCs w:val="24"/>
         </w:rPr>
-        <w:t>Enlace al tablero del equipo en ClickUp</w:t>
-      </w:r>
+        <w:t xml:space="preserve">Enlace al tablero del equipo en </w:t>
+      </w:r>
+      <w:proofErr w:type="spellStart"/>
+      <w:r>
+        <w:rPr>
+          <w:rFonts w:ascii="Times New Roman" w:hAnsi="Times New Roman" w:cs="Times New Roman"/>
+          <w:sz w:val="24"/>
+          <w:szCs w:val="24"/>
+        </w:rPr>
+        <w:t>ClickUp</w:t>
+      </w:r>
+      <w:proofErr w:type="spellEnd"/>
     </w:p>
     <w:p>
       <w:pPr>
@@ -965,6 +1078,14 @@
           <w:szCs w:val="24"/>
         </w:rPr>
       </w:pPr>
+      <w:r>
+        <w:rPr>
+          <w:rFonts w:ascii="Times New Roman" w:hAnsi="Times New Roman" w:cs="Times New Roman"/>
+          <w:sz w:val="24"/>
+          <w:szCs w:val="24"/>
+        </w:rPr>
+        <w:t xml:space="preserve">Violeta </w:t>
+      </w:r>
     </w:p>
     <w:sectPr>
       <w:pgSz w:w="11906" w:h="16838"/>

</xml_diff>